<commit_message>
📊 Daily Chinese DB update: 2026-06-03 | 158/2000 expressions
</commit_message>
<xml_diff>
--- a/data/03_Print_PDF/Study_Note_2026-06-03.docx
+++ b/data/03_Print_PDF/Study_Note_2026-06-03.docx
@@ -33,7 +33,7 @@
           <w:sz w:val="18"/>
           <w:rFonts w:eastAsia="Microsoft YaHei" w:ascii="맑은 고딕"/>
         </w:rPr>
-        <w:t>오늘의 핵심 네이티브 표현  4개  ·  한어 병음 · 한국어 의미 · 원문 · 실전 예문 수록</w:t>
+        <w:t>오늘의 핵심 네이티브 표현  1개  ·  한어 병음 · 한국어 의미 · 원문 · 실전 예문 수록</w:t>
       </w:r>
     </w:p>
     <w:p>
@@ -60,7 +60,7 @@
           <w:sz w:val="28"/>
           <w:rFonts w:eastAsia="Microsoft YaHei" w:ascii="Microsoft YaHei"/>
         </w:rPr>
-        <w:t>深耕</w:t>
+        <w:t>用人单位</w:t>
       </w:r>
       <w:r>
         <w:rPr>
@@ -71,7 +71,7 @@
           <w:sz w:val="18"/>
           <w:rFonts w:eastAsia="Microsoft YaHei" w:ascii="Calibri"/>
         </w:rPr>
-        <w:t xml:space="preserve">   [VERB]</w:t>
+        <w:t xml:space="preserve">   [NOUN]</w:t>
       </w:r>
     </w:p>
     <w:p>
@@ -97,7 +97,7 @@
           <w:sz w:val="20"/>
           <w:rFonts w:eastAsia="Microsoft YaHei" w:ascii="Calibri"/>
         </w:rPr>
-        <w:t>shēn gēng</w:t>
+        <w:t>yòngrén dānwèi</w:t>
       </w:r>
     </w:p>
     <w:p>
@@ -123,7 +123,7 @@
           <w:sz w:val="21"/>
           <w:rFonts w:eastAsia="Microsoft YaHei" w:ascii="맑은 고딕"/>
         </w:rPr>
-        <w:t>깊이 경작하다, 심층적으로 파고들다 (비유적으로)</w:t>
+        <w:t>고용주, 사용자 (회사, 기관 등)</w:t>
       </w:r>
     </w:p>
     <w:p>
@@ -150,7 +150,7 @@
           <w:sz w:val="19"/>
           <w:rFonts w:eastAsia="Microsoft YaHei" w:ascii="Microsoft YaHei"/>
         </w:rPr>
-        <w:t>"北京多所学校深耕健..."</w:t>
+        <w:t>"用人单位未签订劳动合同、未缴纳工伤保险，员工因工死亡后，单位直接否认劳动关系，拒绝支付任何赔偿，甚至失联跑路。"</w:t>
       </w:r>
     </w:p>
     <w:p>
@@ -177,487 +177,7 @@
           <w:sz w:val="21"/>
           <w:rFonts w:eastAsia="Microsoft YaHei" w:ascii="Microsoft YaHei"/>
         </w:rPr>
-        <w:t>这家公司在人工智能领域深耕多年，积累了丰富的经验。</w:t>
-      </w:r>
-    </w:p>
-    <w:p>
-      <w:pPr>
-        <w:spacing w:before="120" w:after="0"/>
-      </w:pPr>
-      <w:r>
-        <w:rPr>
-          <w:rFonts w:ascii="맑은 고딕" w:hAnsi="맑은 고딕"/>
-          <w:b w:val="0"/>
-          <w:i w:val="0"/>
-          <w:color w:val="C8C8C8"/>
-          <w:sz w:val="14"/>
-          <w:rFonts w:eastAsia="Microsoft YaHei" w:ascii="맑은 고딕"/>
-        </w:rPr>
-        <w:t>────────────────────────────────────────────────────────────</w:t>
-      </w:r>
-    </w:p>
-    <w:p>
-      <w:pPr>
-        <w:spacing w:before="200" w:after="40"/>
-      </w:pPr>
-      <w:r>
-        <w:rPr>
-          <w:rFonts w:ascii="맑은 고딕" w:hAnsi="맑은 고딕"/>
-          <w:b w:val="0"/>
-          <w:i w:val="0"/>
-          <w:color w:val="969696"/>
-          <w:sz w:val="20"/>
-          <w:rFonts w:eastAsia="Microsoft YaHei" w:ascii="맑은 고딕"/>
-        </w:rPr>
-        <w:t xml:space="preserve">002.  </w:t>
-      </w:r>
-      <w:r>
-        <w:rPr>
-          <w:rFonts w:ascii="Microsoft YaHei" w:hAnsi="Microsoft YaHei"/>
-          <w:b/>
-          <w:i w:val="0"/>
-          <w:color w:val="143CB4"/>
-          <w:sz w:val="28"/>
-          <w:rFonts w:eastAsia="Microsoft YaHei" w:ascii="Microsoft YaHei"/>
-        </w:rPr>
-        <w:t>践行</w:t>
-      </w:r>
-      <w:r>
-        <w:rPr>
-          <w:rFonts w:ascii="Calibri" w:hAnsi="Calibri"/>
-          <w:b w:val="0"/>
-          <w:i w:val="0"/>
-          <w:color w:val="787878"/>
-          <w:sz w:val="18"/>
-          <w:rFonts w:eastAsia="Microsoft YaHei" w:ascii="Calibri"/>
-        </w:rPr>
-        <w:t xml:space="preserve">   [VERB]</w:t>
-      </w:r>
-    </w:p>
-    <w:p>
-      <w:pPr>
-        <w:spacing w:before="0" w:after="40"/>
-      </w:pPr>
-      <w:r>
-        <w:rPr>
-          <w:rFonts w:ascii="맑은 고딕" w:hAnsi="맑은 고딕"/>
-          <w:b w:val="0"/>
-          <w:i w:val="0"/>
-          <w:sz w:val="20"/>
-          <w:rFonts w:eastAsia="Microsoft YaHei" w:ascii="맑은 고딕"/>
-        </w:rPr>
-        <w:t xml:space="preserve">🔊 </w:t>
-      </w:r>
-      <w:r>
-        <w:rPr>
-          <w:rFonts w:ascii="Calibri" w:hAnsi="Calibri"/>
-          <w:b w:val="0"/>
-          <w:i/>
-          <w:color w:val="505050"/>
-          <w:sz w:val="20"/>
-          <w:rFonts w:eastAsia="Microsoft YaHei" w:ascii="Calibri"/>
-        </w:rPr>
-        <w:t>jiàn xíng</w:t>
-      </w:r>
-    </w:p>
-    <w:p>
-      <w:pPr>
-        <w:spacing w:before="0" w:after="60"/>
-      </w:pPr>
-      <w:r>
-        <w:rPr>
-          <w:rFonts w:ascii="맑은 고딕" w:hAnsi="맑은 고딕"/>
-          <w:b/>
-          <w:i w:val="0"/>
-          <w:color w:val="282828"/>
-          <w:sz w:val="20"/>
-          <w:rFonts w:eastAsia="Microsoft YaHei" w:ascii="맑은 고딕"/>
-        </w:rPr>
-        <w:t xml:space="preserve">💡 의미  </w:t>
-      </w:r>
-      <w:r>
-        <w:rPr>
-          <w:rFonts w:ascii="맑은 고딕" w:hAnsi="맑은 고딕"/>
-          <w:b w:val="0"/>
-          <w:i w:val="0"/>
-          <w:sz w:val="21"/>
-          <w:rFonts w:eastAsia="Microsoft YaHei" w:ascii="맑은 고딕"/>
-        </w:rPr>
-        <w:t>실천하다; 이행하다</w:t>
-      </w:r>
-    </w:p>
-    <w:p>
-      <w:pPr>
-        <w:spacing w:before="0" w:after="40"/>
-      </w:pPr>
-      <w:r>
-        <w:rPr>
-          <w:rFonts w:ascii="맑은 고딕" w:hAnsi="맑은 고딕"/>
-          <w:b/>
-          <w:i w:val="0"/>
-          <w:color w:val="646464"/>
-          <w:sz w:val="19"/>
-          <w:rFonts w:eastAsia="Microsoft YaHei" w:ascii="맑은 고딕"/>
-        </w:rPr>
-        <w:t xml:space="preserve">📌 원문  </w:t>
-      </w:r>
-      <w:r>
-        <w:rPr>
-          <w:rFonts w:ascii="Microsoft YaHei" w:hAnsi="Microsoft YaHei"/>
-          <w:b w:val="0"/>
-          <w:i/>
-          <w:color w:val="5A5A5A"/>
-          <w:sz w:val="19"/>
-          <w:rFonts w:eastAsia="Microsoft YaHei" w:ascii="Microsoft YaHei"/>
-        </w:rPr>
-        <w:t>"践行志愿服务..."</w:t>
-      </w:r>
-    </w:p>
-    <w:p>
-      <w:pPr>
-        <w:spacing w:before="40" w:after="40"/>
-      </w:pPr>
-      <w:r>
-        <w:rPr>
-          <w:rFonts w:ascii="맑은 고딕" w:hAnsi="맑은 고딕"/>
-          <w:b/>
-          <w:i w:val="0"/>
-          <w:color w:val="007850"/>
-          <w:sz w:val="20"/>
-          <w:rFonts w:eastAsia="Microsoft YaHei" w:ascii="맑은 고딕"/>
-        </w:rPr>
-        <w:t xml:space="preserve">✏️ 예문  </w:t>
-      </w:r>
-      <w:r>
-        <w:rPr>
-          <w:rFonts w:ascii="Microsoft YaHei" w:hAnsi="Microsoft YaHei"/>
-          <w:b/>
-          <w:i w:val="0"/>
-          <w:color w:val="00643C"/>
-          <w:sz w:val="21"/>
-          <w:rFonts w:eastAsia="Microsoft YaHei" w:ascii="Microsoft YaHei"/>
-        </w:rPr>
-        <w:t>我们应该在日常工作中践行公司的核心价值观。</w:t>
-      </w:r>
-    </w:p>
-    <w:p>
-      <w:pPr>
-        <w:spacing w:before="120" w:after="0"/>
-      </w:pPr>
-      <w:r>
-        <w:rPr>
-          <w:rFonts w:ascii="맑은 고딕" w:hAnsi="맑은 고딕"/>
-          <w:b w:val="0"/>
-          <w:i w:val="0"/>
-          <w:color w:val="C8C8C8"/>
-          <w:sz w:val="14"/>
-          <w:rFonts w:eastAsia="Microsoft YaHei" w:ascii="맑은 고딕"/>
-        </w:rPr>
-        <w:t>────────────────────────────────────────────────────────────</w:t>
-      </w:r>
-    </w:p>
-    <w:p>
-      <w:pPr>
-        <w:spacing w:before="200" w:after="40"/>
-      </w:pPr>
-      <w:r>
-        <w:rPr>
-          <w:rFonts w:ascii="맑은 고딕" w:hAnsi="맑은 고딕"/>
-          <w:b w:val="0"/>
-          <w:i w:val="0"/>
-          <w:color w:val="969696"/>
-          <w:sz w:val="20"/>
-          <w:rFonts w:eastAsia="Microsoft YaHei" w:ascii="맑은 고딕"/>
-        </w:rPr>
-        <w:t xml:space="preserve">003.  </w:t>
-      </w:r>
-      <w:r>
-        <w:rPr>
-          <w:rFonts w:ascii="Microsoft YaHei" w:hAnsi="Microsoft YaHei"/>
-          <w:b/>
-          <w:i w:val="0"/>
-          <w:color w:val="143CB4"/>
-          <w:sz w:val="28"/>
-          <w:rFonts w:eastAsia="Microsoft YaHei" w:ascii="Microsoft YaHei"/>
-        </w:rPr>
-        <w:t>抱团</w:t>
-      </w:r>
-      <w:r>
-        <w:rPr>
-          <w:rFonts w:ascii="Calibri" w:hAnsi="Calibri"/>
-          <w:b w:val="0"/>
-          <w:i w:val="0"/>
-          <w:color w:val="787878"/>
-          <w:sz w:val="18"/>
-          <w:rFonts w:eastAsia="Microsoft YaHei" w:ascii="Calibri"/>
-        </w:rPr>
-        <w:t xml:space="preserve">   [COLLOQUIALISM]</w:t>
-      </w:r>
-    </w:p>
-    <w:p>
-      <w:pPr>
-        <w:spacing w:before="0" w:after="40"/>
-      </w:pPr>
-      <w:r>
-        <w:rPr>
-          <w:rFonts w:ascii="맑은 고딕" w:hAnsi="맑은 고딕"/>
-          <w:b w:val="0"/>
-          <w:i w:val="0"/>
-          <w:sz w:val="20"/>
-          <w:rFonts w:eastAsia="Microsoft YaHei" w:ascii="맑은 고딕"/>
-        </w:rPr>
-        <w:t xml:space="preserve">🔊 </w:t>
-      </w:r>
-      <w:r>
-        <w:rPr>
-          <w:rFonts w:ascii="Calibri" w:hAnsi="Calibri"/>
-          <w:b w:val="0"/>
-          <w:i/>
-          <w:color w:val="505050"/>
-          <w:sz w:val="20"/>
-          <w:rFonts w:eastAsia="Microsoft YaHei" w:ascii="Calibri"/>
-        </w:rPr>
-        <w:t>bàotuán</w:t>
-      </w:r>
-    </w:p>
-    <w:p>
-      <w:pPr>
-        <w:spacing w:before="0" w:after="60"/>
-      </w:pPr>
-      <w:r>
-        <w:rPr>
-          <w:rFonts w:ascii="맑은 고딕" w:hAnsi="맑은 고딕"/>
-          <w:b/>
-          <w:i w:val="0"/>
-          <w:color w:val="282828"/>
-          <w:sz w:val="20"/>
-          <w:rFonts w:eastAsia="Microsoft YaHei" w:ascii="맑은 고딕"/>
-        </w:rPr>
-        <w:t xml:space="preserve">💡 의미  </w:t>
-      </w:r>
-      <w:r>
-        <w:rPr>
-          <w:rFonts w:ascii="맑은 고딕" w:hAnsi="맑은 고딕"/>
-          <w:b w:val="0"/>
-          <w:i w:val="0"/>
-          <w:sz w:val="21"/>
-          <w:rFonts w:eastAsia="Microsoft YaHei" w:ascii="맑은 고딕"/>
-        </w:rPr>
-        <w:t>뭉치다, 단결하다 (서로 돕기 위해)</w:t>
-      </w:r>
-    </w:p>
-    <w:p>
-      <w:pPr>
-        <w:spacing w:before="0" w:after="40"/>
-      </w:pPr>
-      <w:r>
-        <w:rPr>
-          <w:rFonts w:ascii="맑은 고딕" w:hAnsi="맑은 고딕"/>
-          <w:b/>
-          <w:i w:val="0"/>
-          <w:color w:val="646464"/>
-          <w:sz w:val="19"/>
-          <w:rFonts w:eastAsia="Microsoft YaHei" w:ascii="맑은 고딕"/>
-        </w:rPr>
-        <w:t xml:space="preserve">📌 원문  </w:t>
-      </w:r>
-      <w:r>
-        <w:rPr>
-          <w:rFonts w:ascii="Microsoft YaHei" w:hAnsi="Microsoft YaHei"/>
-          <w:b w:val="0"/>
-          <w:i/>
-          <w:color w:val="5A5A5A"/>
-          <w:sz w:val="19"/>
-          <w:rFonts w:eastAsia="Microsoft YaHei" w:ascii="Microsoft YaHei"/>
-        </w:rPr>
-        <w:t>"麻江教育“抱团记”."</w:t>
-      </w:r>
-    </w:p>
-    <w:p>
-      <w:pPr>
-        <w:spacing w:before="40" w:after="40"/>
-      </w:pPr>
-      <w:r>
-        <w:rPr>
-          <w:rFonts w:ascii="맑은 고딕" w:hAnsi="맑은 고딕"/>
-          <w:b/>
-          <w:i w:val="0"/>
-          <w:color w:val="007850"/>
-          <w:sz w:val="20"/>
-          <w:rFonts w:eastAsia="Microsoft YaHei" w:ascii="맑은 고딕"/>
-        </w:rPr>
-        <w:t xml:space="preserve">✏️ 예문  </w:t>
-      </w:r>
-      <w:r>
-        <w:rPr>
-          <w:rFonts w:ascii="Microsoft YaHei" w:hAnsi="Microsoft YaHei"/>
-          <w:b/>
-          <w:i w:val="0"/>
-          <w:color w:val="00643C"/>
-          <w:sz w:val="21"/>
-          <w:rFonts w:eastAsia="Microsoft YaHei" w:ascii="Microsoft YaHei"/>
-        </w:rPr>
-        <w:t>面对激烈的市场竞争，小公司更需要抱团取暖，共同发展。</w:t>
-      </w:r>
-    </w:p>
-    <w:p>
-      <w:pPr>
-        <w:spacing w:before="120" w:after="0"/>
-      </w:pPr>
-      <w:r>
-        <w:rPr>
-          <w:rFonts w:ascii="맑은 고딕" w:hAnsi="맑은 고딕"/>
-          <w:b w:val="0"/>
-          <w:i w:val="0"/>
-          <w:color w:val="C8C8C8"/>
-          <w:sz w:val="14"/>
-          <w:rFonts w:eastAsia="Microsoft YaHei" w:ascii="맑은 고딕"/>
-        </w:rPr>
-        <w:t>────────────────────────────────────────────────────────────</w:t>
-      </w:r>
-    </w:p>
-    <w:p>
-      <w:pPr>
-        <w:spacing w:before="200" w:after="40"/>
-      </w:pPr>
-      <w:r>
-        <w:rPr>
-          <w:rFonts w:ascii="맑은 고딕" w:hAnsi="맑은 고딕"/>
-          <w:b w:val="0"/>
-          <w:i w:val="0"/>
-          <w:color w:val="969696"/>
-          <w:sz w:val="20"/>
-          <w:rFonts w:eastAsia="Microsoft YaHei" w:ascii="맑은 고딕"/>
-        </w:rPr>
-        <w:t xml:space="preserve">004.  </w:t>
-      </w:r>
-      <w:r>
-        <w:rPr>
-          <w:rFonts w:ascii="Microsoft YaHei" w:hAnsi="Microsoft YaHei"/>
-          <w:b/>
-          <w:i w:val="0"/>
-          <w:color w:val="143CB4"/>
-          <w:sz w:val="28"/>
-          <w:rFonts w:eastAsia="Microsoft YaHei" w:ascii="Microsoft YaHei"/>
-        </w:rPr>
-        <w:t>扫码添加</w:t>
-      </w:r>
-      <w:r>
-        <w:rPr>
-          <w:rFonts w:ascii="Calibri" w:hAnsi="Calibri"/>
-          <w:b w:val="0"/>
-          <w:i w:val="0"/>
-          <w:color w:val="787878"/>
-          <w:sz w:val="18"/>
-          <w:rFonts w:eastAsia="Microsoft YaHei" w:ascii="Calibri"/>
-        </w:rPr>
-        <w:t xml:space="preserve">   [VERB PHRASE]</w:t>
-      </w:r>
-    </w:p>
-    <w:p>
-      <w:pPr>
-        <w:spacing w:before="0" w:after="40"/>
-      </w:pPr>
-      <w:r>
-        <w:rPr>
-          <w:rFonts w:ascii="맑은 고딕" w:hAnsi="맑은 고딕"/>
-          <w:b w:val="0"/>
-          <w:i w:val="0"/>
-          <w:sz w:val="20"/>
-          <w:rFonts w:eastAsia="Microsoft YaHei" w:ascii="맑은 고딕"/>
-        </w:rPr>
-        <w:t xml:space="preserve">🔊 </w:t>
-      </w:r>
-      <w:r>
-        <w:rPr>
-          <w:rFonts w:ascii="Calibri" w:hAnsi="Calibri"/>
-          <w:b w:val="0"/>
-          <w:i/>
-          <w:color w:val="505050"/>
-          <w:sz w:val="20"/>
-          <w:rFonts w:eastAsia="Microsoft YaHei" w:ascii="Calibri"/>
-        </w:rPr>
-        <w:t>sǎomǎ tiānjiā</w:t>
-      </w:r>
-    </w:p>
-    <w:p>
-      <w:pPr>
-        <w:spacing w:before="0" w:after="60"/>
-      </w:pPr>
-      <w:r>
-        <w:rPr>
-          <w:rFonts w:ascii="맑은 고딕" w:hAnsi="맑은 고딕"/>
-          <w:b/>
-          <w:i w:val="0"/>
-          <w:color w:val="282828"/>
-          <w:sz w:val="20"/>
-          <w:rFonts w:eastAsia="Microsoft YaHei" w:ascii="맑은 고딕"/>
-        </w:rPr>
-        <w:t xml:space="preserve">💡 의미  </w:t>
-      </w:r>
-      <w:r>
-        <w:rPr>
-          <w:rFonts w:ascii="맑은 고딕" w:hAnsi="맑은 고딕"/>
-          <w:b w:val="0"/>
-          <w:i w:val="0"/>
-          <w:sz w:val="21"/>
-          <w:rFonts w:eastAsia="Microsoft YaHei" w:ascii="맑은 고딕"/>
-        </w:rPr>
-        <w:t>QR 코드를 스캔하여 추가하다</w:t>
-      </w:r>
-    </w:p>
-    <w:p>
-      <w:pPr>
-        <w:spacing w:before="0" w:after="40"/>
-      </w:pPr>
-      <w:r>
-        <w:rPr>
-          <w:rFonts w:ascii="맑은 고딕" w:hAnsi="맑은 고딕"/>
-          <w:b/>
-          <w:i w:val="0"/>
-          <w:color w:val="646464"/>
-          <w:sz w:val="19"/>
-          <w:rFonts w:eastAsia="Microsoft YaHei" w:ascii="맑은 고딕"/>
-        </w:rPr>
-        <w:t xml:space="preserve">📌 원문  </w:t>
-      </w:r>
-      <w:r>
-        <w:rPr>
-          <w:rFonts w:ascii="Microsoft YaHei" w:hAnsi="Microsoft YaHei"/>
-          <w:b w:val="0"/>
-          <w:i/>
-          <w:color w:val="5A5A5A"/>
-          <w:sz w:val="19"/>
-          <w:rFonts w:eastAsia="Microsoft YaHei" w:ascii="Microsoft YaHei"/>
-        </w:rPr>
-        <w:t>"为获取密码“扫码添加..."</w:t>
-      </w:r>
-    </w:p>
-    <w:p>
-      <w:pPr>
-        <w:spacing w:before="40" w:after="40"/>
-      </w:pPr>
-      <w:r>
-        <w:rPr>
-          <w:rFonts w:ascii="맑은 고딕" w:hAnsi="맑은 고딕"/>
-          <w:b/>
-          <w:i w:val="0"/>
-          <w:color w:val="007850"/>
-          <w:sz w:val="20"/>
-          <w:rFonts w:eastAsia="Microsoft YaHei" w:ascii="맑은 고딕"/>
-        </w:rPr>
-        <w:t xml:space="preserve">✏️ 예문  </w:t>
-      </w:r>
-      <w:r>
-        <w:rPr>
-          <w:rFonts w:ascii="Microsoft YaHei" w:hAnsi="Microsoft YaHei"/>
-          <w:b/>
-          <w:i w:val="0"/>
-          <w:color w:val="00643C"/>
-          <w:sz w:val="21"/>
-          <w:rFonts w:eastAsia="Microsoft YaHei" w:ascii="Microsoft YaHei"/>
-        </w:rPr>
-        <w:t>你可以扫码添加我的微信，方便以后联系。</w:t>
+        <w:t>在入职前，一定要仔细了解用人单位的规章制度。</w:t>
       </w:r>
     </w:p>
     <w:sectPr>

</xml_diff>

<commit_message>
📊 Daily Chinese DB update: 2026-06-03 | 160/2000 expressions
</commit_message>
<xml_diff>
--- a/data/03_Print_PDF/Study_Note_2026-06-03.docx
+++ b/data/03_Print_PDF/Study_Note_2026-06-03.docx
@@ -33,7 +33,7 @@
           <w:sz w:val="18"/>
           <w:rFonts w:eastAsia="Microsoft YaHei" w:ascii="맑은 고딕"/>
         </w:rPr>
-        <w:t>오늘의 핵심 네이티브 표현  1개  ·  한어 병음 · 한국어 의미 · 원문 · 실전 예문 수록</w:t>
+        <w:t>오늘의 핵심 네이티브 표현  2개  ·  한어 병음 · 한국어 의미 · 원문 · 실전 예문 수록</w:t>
       </w:r>
     </w:p>
     <w:p>
@@ -60,7 +60,7 @@
           <w:sz w:val="28"/>
           <w:rFonts w:eastAsia="Microsoft YaHei" w:ascii="Microsoft YaHei"/>
         </w:rPr>
-        <w:t>用人单位</w:t>
+        <w:t>签订劳动合同</w:t>
       </w:r>
       <w:r>
         <w:rPr>
@@ -71,7 +71,7 @@
           <w:sz w:val="18"/>
           <w:rFonts w:eastAsia="Microsoft YaHei" w:ascii="Calibri"/>
         </w:rPr>
-        <w:t xml:space="preserve">   [NOUN]</w:t>
+        <w:t xml:space="preserve">   [SEPARABLE VERB PHRASE]</w:t>
       </w:r>
     </w:p>
     <w:p>
@@ -97,7 +97,7 @@
           <w:sz w:val="20"/>
           <w:rFonts w:eastAsia="Microsoft YaHei" w:ascii="Calibri"/>
         </w:rPr>
-        <w:t>yòngrén dānwèi</w:t>
+        <w:t>qiāndìng láodòng hétong</w:t>
       </w:r>
     </w:p>
     <w:p>
@@ -123,7 +123,7 @@
           <w:sz w:val="21"/>
           <w:rFonts w:eastAsia="Microsoft YaHei" w:ascii="맑은 고딕"/>
         </w:rPr>
-        <w:t>고용주, 사용자 (회사, 기관 등)</w:t>
+        <w:t>근로 계약을 체결하다</w:t>
       </w:r>
     </w:p>
     <w:p>
@@ -150,7 +150,7 @@
           <w:sz w:val="19"/>
           <w:rFonts w:eastAsia="Microsoft YaHei" w:ascii="Microsoft YaHei"/>
         </w:rPr>
-        <w:t>"用人单位未签订劳动合同、未缴纳工伤保险，员工因工死亡后，单位直接否认劳动关系，拒绝支付任何赔偿，甚至失联跑路。"</w:t>
+        <w:t>"用人单位未签订劳动合同、未缴纳工伤保险..."</w:t>
       </w:r>
     </w:p>
     <w:p>
@@ -177,7 +177,167 @@
           <w:sz w:val="21"/>
           <w:rFonts w:eastAsia="Microsoft YaHei" w:ascii="Microsoft YaHei"/>
         </w:rPr>
-        <w:t>在入职前，一定要仔细了解用人单位的规章制度。</w:t>
+        <w:t>新员工入职前，必须先签订劳动合同，明确双方的权利义务。</w:t>
+      </w:r>
+    </w:p>
+    <w:p>
+      <w:pPr>
+        <w:spacing w:before="120" w:after="0"/>
+      </w:pPr>
+      <w:r>
+        <w:rPr>
+          <w:rFonts w:ascii="맑은 고딕" w:hAnsi="맑은 고딕"/>
+          <w:b w:val="0"/>
+          <w:i w:val="0"/>
+          <w:color w:val="C8C8C8"/>
+          <w:sz w:val="14"/>
+          <w:rFonts w:eastAsia="Microsoft YaHei" w:ascii="맑은 고딕"/>
+        </w:rPr>
+        <w:t>────────────────────────────────────────────────────────────</w:t>
+      </w:r>
+    </w:p>
+    <w:p>
+      <w:pPr>
+        <w:spacing w:before="200" w:after="40"/>
+      </w:pPr>
+      <w:r>
+        <w:rPr>
+          <w:rFonts w:ascii="맑은 고딕" w:hAnsi="맑은 고딕"/>
+          <w:b w:val="0"/>
+          <w:i w:val="0"/>
+          <w:color w:val="969696"/>
+          <w:sz w:val="20"/>
+          <w:rFonts w:eastAsia="Microsoft YaHei" w:ascii="맑은 고딕"/>
+        </w:rPr>
+        <w:t xml:space="preserve">002.  </w:t>
+      </w:r>
+      <w:r>
+        <w:rPr>
+          <w:rFonts w:ascii="Microsoft YaHei" w:hAnsi="Microsoft YaHei"/>
+          <w:b/>
+          <w:i w:val="0"/>
+          <w:color w:val="143CB4"/>
+          <w:sz w:val="28"/>
+          <w:rFonts w:eastAsia="Microsoft YaHei" w:ascii="Microsoft YaHei"/>
+        </w:rPr>
+        <w:t>作证据</w:t>
+      </w:r>
+      <w:r>
+        <w:rPr>
+          <w:rFonts w:ascii="Calibri" w:hAnsi="Calibri"/>
+          <w:b w:val="0"/>
+          <w:i w:val="0"/>
+          <w:color w:val="787878"/>
+          <w:sz w:val="18"/>
+          <w:rFonts w:eastAsia="Microsoft YaHei" w:ascii="Calibri"/>
+        </w:rPr>
+        <w:t xml:space="preserve">   [VERB PHRASE]</w:t>
+      </w:r>
+    </w:p>
+    <w:p>
+      <w:pPr>
+        <w:spacing w:before="0" w:after="40"/>
+      </w:pPr>
+      <w:r>
+        <w:rPr>
+          <w:rFonts w:ascii="맑은 고딕" w:hAnsi="맑은 고딕"/>
+          <w:b w:val="0"/>
+          <w:i w:val="0"/>
+          <w:sz w:val="20"/>
+          <w:rFonts w:eastAsia="Microsoft YaHei" w:ascii="맑은 고딕"/>
+        </w:rPr>
+        <w:t xml:space="preserve">🔊 </w:t>
+      </w:r>
+      <w:r>
+        <w:rPr>
+          <w:rFonts w:ascii="Calibri" w:hAnsi="Calibri"/>
+          <w:b w:val="0"/>
+          <w:i/>
+          <w:color w:val="505050"/>
+          <w:sz w:val="20"/>
+          <w:rFonts w:eastAsia="Microsoft YaHei" w:ascii="Calibri"/>
+        </w:rPr>
+        <w:t>zuò zhèng jù</w:t>
+      </w:r>
+    </w:p>
+    <w:p>
+      <w:pPr>
+        <w:spacing w:before="0" w:after="60"/>
+      </w:pPr>
+      <w:r>
+        <w:rPr>
+          <w:rFonts w:ascii="맑은 고딕" w:hAnsi="맑은 고딕"/>
+          <w:b/>
+          <w:i w:val="0"/>
+          <w:color w:val="282828"/>
+          <w:sz w:val="20"/>
+          <w:rFonts w:eastAsia="Microsoft YaHei" w:ascii="맑은 고딕"/>
+        </w:rPr>
+        <w:t xml:space="preserve">💡 의미  </w:t>
+      </w:r>
+      <w:r>
+        <w:rPr>
+          <w:rFonts w:ascii="맑은 고딕" w:hAnsi="맑은 고딕"/>
+          <w:b w:val="0"/>
+          <w:i w:val="0"/>
+          <w:sz w:val="21"/>
+          <w:rFonts w:eastAsia="Microsoft YaHei" w:ascii="맑은 고딕"/>
+        </w:rPr>
+        <w:t>증거로 삼다, 증거가 되다</w:t>
+      </w:r>
+    </w:p>
+    <w:p>
+      <w:pPr>
+        <w:spacing w:before="0" w:after="40"/>
+      </w:pPr>
+      <w:r>
+        <w:rPr>
+          <w:rFonts w:ascii="맑은 고딕" w:hAnsi="맑은 고딕"/>
+          <w:b/>
+          <w:i w:val="0"/>
+          <w:color w:val="646464"/>
+          <w:sz w:val="19"/>
+          <w:rFonts w:eastAsia="Microsoft YaHei" w:ascii="맑은 고딕"/>
+        </w:rPr>
+        <w:t xml:space="preserve">📌 원문  </w:t>
+      </w:r>
+      <w:r>
+        <w:rPr>
+          <w:rFonts w:ascii="Microsoft YaHei" w:hAnsi="Microsoft YaHei"/>
+          <w:b w:val="0"/>
+          <w:i/>
+          <w:color w:val="5A5A5A"/>
+          <w:sz w:val="19"/>
+          <w:rFonts w:eastAsia="Microsoft YaHei" w:ascii="Microsoft YaHei"/>
+        </w:rPr>
+        <w:t>"“AI生成照片”作证据？"</w:t>
+      </w:r>
+    </w:p>
+    <w:p>
+      <w:pPr>
+        <w:spacing w:before="40" w:after="40"/>
+      </w:pPr>
+      <w:r>
+        <w:rPr>
+          <w:rFonts w:ascii="맑은 고딕" w:hAnsi="맑은 고딕"/>
+          <w:b/>
+          <w:i w:val="0"/>
+          <w:color w:val="007850"/>
+          <w:sz w:val="20"/>
+          <w:rFonts w:eastAsia="Microsoft YaHei" w:ascii="맑은 고딕"/>
+        </w:rPr>
+        <w:t xml:space="preserve">✏️ 예문  </w:t>
+      </w:r>
+      <w:r>
+        <w:rPr>
+          <w:rFonts w:ascii="Microsoft YaHei" w:hAnsi="Microsoft YaHei"/>
+          <w:b/>
+          <w:i w:val="0"/>
+          <w:color w:val="00643C"/>
+          <w:sz w:val="21"/>
+          <w:rFonts w:eastAsia="Microsoft YaHei" w:ascii="Microsoft YaHei"/>
+        </w:rPr>
+        <w:t>你的证词可以作证据提交给警方。</w:t>
       </w:r>
     </w:p>
     <w:sectPr>

</xml_diff>